<commit_message>
inclusão do terceiro artigo da semana 2
</commit_message>
<xml_diff>
--- a/documentos/08 03 2026 O Artigo 42 do CDC.docx
+++ b/documentos/08 03 2026 O Artigo 42 do CDC.docx
@@ -71,43 +71,29 @@
     <w:p>
       <w:pPr>
         <w:spacing w:after="0"/>
-        <w:rPr>
-          <w:u w:val="single"/>
-        </w:rPr>
-      </w:pPr>
-      <w:r>
-        <w:rPr>
-          <w:u w:val="single"/>
-        </w:rPr>
+      </w:pPr>
+      <w:r>
         <w:t xml:space="preserve">O </w:t>
       </w:r>
       <w:r>
         <w:rPr>
           <w:b/>
           <w:bCs/>
-          <w:u w:val="single"/>
         </w:rPr>
         <w:t>Artigo 42</w:t>
       </w:r>
       <w:r>
-        <w:rPr>
-          <w:u w:val="single"/>
-        </w:rPr>
         <w:t xml:space="preserve"> é a pedra angular da proteção contra o abuso bancário. Ele estabelece de forma categórica:</w:t>
       </w:r>
     </w:p>
     <w:p>
       <w:pPr>
         <w:spacing w:after="0"/>
-        <w:rPr>
-          <w:u w:val="single"/>
-        </w:rPr>
       </w:pPr>
       <w:r>
         <w:rPr>
           <w:i/>
           <w:iCs/>
-          <w:u w:val="single"/>
         </w:rPr>
         <w:t>"Na cobrança de débitos, o consumidor não será exposto a ridículo, nem será submetido a qualquer tipo de constrangimento ou ameaça."</w:t>
       </w:r>
@@ -115,15 +101,11 @@
     <w:p>
       <w:pPr>
         <w:spacing w:after="0"/>
-        <w:rPr>
-          <w:u w:val="single"/>
-        </w:rPr>
       </w:pPr>
       <w:r>
         <w:rPr>
           <w:b/>
           <w:bCs/>
-          <w:u w:val="single"/>
         </w:rPr>
         <w:t>O que isso significa na prática do Stalking Bancário?</w:t>
       </w:r>
@@ -135,22 +117,15 @@
           <w:numId w:val="1"/>
         </w:numPr>
         <w:spacing w:after="0"/>
-        <w:rPr>
-          <w:u w:val="single"/>
-        </w:rPr>
       </w:pPr>
       <w:r>
         <w:rPr>
           <w:b/>
           <w:bCs/>
-          <w:u w:val="single"/>
         </w:rPr>
         <w:t>Ridículo:</w:t>
       </w:r>
       <w:r>
-        <w:rPr>
-          <w:u w:val="single"/>
-        </w:rPr>
         <w:t xml:space="preserve"> Quando o banco liga para familiares, vizinhos ou para o seu local de trabalho, expondo sua situação financeira a terceiros.</w:t>
       </w:r>
     </w:p>
@@ -161,36 +136,25 @@
           <w:numId w:val="1"/>
         </w:numPr>
         <w:spacing w:after="0"/>
-        <w:rPr>
-          <w:u w:val="single"/>
-        </w:rPr>
       </w:pPr>
       <w:r>
         <w:rPr>
           <w:b/>
           <w:bCs/>
-          <w:u w:val="single"/>
         </w:rPr>
         <w:t>Constrangimento:</w:t>
       </w:r>
       <w:r>
-        <w:rPr>
-          <w:u w:val="single"/>
-        </w:rPr>
         <w:t xml:space="preserve"> O uso de </w:t>
       </w:r>
       <w:r>
         <w:rPr>
           <w:b/>
           <w:bCs/>
-          <w:u w:val="single"/>
         </w:rPr>
         <w:t>discadores preditivos</w:t>
       </w:r>
       <w:r>
-        <w:rPr>
-          <w:u w:val="single"/>
-        </w:rPr>
         <w:t xml:space="preserve"> que interrompem seu sono, suas refeições ou suas reuniões de trabalho dezenas de vezes ao dia.</w:t>
       </w:r>
     </w:p>
@@ -201,22 +165,15 @@
           <w:numId w:val="1"/>
         </w:numPr>
         <w:spacing w:after="0"/>
-        <w:rPr>
-          <w:u w:val="single"/>
-        </w:rPr>
       </w:pPr>
       <w:r>
         <w:rPr>
           <w:b/>
           <w:bCs/>
-          <w:u w:val="single"/>
         </w:rPr>
         <w:t>Ameaça:</w:t>
       </w:r>
       <w:r>
-        <w:rPr>
-          <w:u w:val="single"/>
-        </w:rPr>
         <w:t xml:space="preserve"> Abordagens que sugerem consequências inexistentes ou que utilizam tom intimidador para forçar um acordo desfavorável.</w:t>
       </w:r>
     </w:p>
@@ -416,485 +373,14 @@
       </w:r>
     </w:p>
     <w:p>
-      <w:r>
-        <w:br w:type="page"/>
-      </w:r>
-    </w:p>
-    <w:p>
       <w:pPr>
         <w:spacing w:after="0"/>
       </w:pPr>
       <w:r>
-        <w:lastRenderedPageBreak/>
-        <w:t xml:space="preserve">Com base no seu pedido de </w:t>
-      </w:r>
-      <w:r>
-        <w:rPr>
-          <w:b/>
-          <w:bCs/>
-        </w:rPr>
-        <w:t>extrema lisura e diligência</w:t>
-      </w:r>
-      <w:r>
-        <w:t>, realizei uma revisão técnica e jurídica do conteúdo do artigo, fundamentando-o estritamente na legislação brasileira, normas infralegais e no entendimento pacificado dos tribunais (jurisprudência).</w:t>
-      </w:r>
-    </w:p>
-    <w:p>
-      <w:pPr>
-        <w:spacing w:after="0"/>
-      </w:pPr>
-      <w:r>
-        <w:t>Abaixo, apresento a validação dos pontos centrais para garantir que o texto seja juridicamente inquestionável e tecnicamente preciso:</w:t>
-      </w:r>
-    </w:p>
-    <w:p>
-      <w:pPr>
-        <w:spacing w:after="0"/>
-      </w:pPr>
-      <w:r>
-        <w:pict w14:anchorId="51262E17">
-          <v:rect id="_x0000_i1033" style="width:0;height:1.5pt" o:hralign="center" o:hrstd="t" o:hrnoshade="t" o:hr="t" fillcolor="gray" stroked="f"/>
+        <w:pict w14:anchorId="0300655A">
+          <v:rect id="_x0000_i1025" style="width:0;height:1.5pt" o:hralign="center" o:hrstd="t" o:hrnoshade="t" o:hr="t" fillcolor="gray" stroked="f"/>
         </w:pict>
       </w:r>
-    </w:p>
-    <w:p>
-      <w:pPr>
-        <w:spacing w:after="0"/>
-        <w:rPr>
-          <w:b/>
-          <w:bCs/>
-        </w:rPr>
-      </w:pPr>
-      <w:r>
-        <w:rPr>
-          <w:b/>
-          <w:bCs/>
-        </w:rPr>
-        <w:t>1. Fundamentação Legal: O Artigo 42 do CDC</w:t>
-      </w:r>
-    </w:p>
-    <w:p>
-      <w:pPr>
-        <w:spacing w:after="0"/>
-      </w:pPr>
-      <w:r>
-        <w:t xml:space="preserve">O texto está em estrita conformidade com a </w:t>
-      </w:r>
-      <w:r>
-        <w:rPr>
-          <w:b/>
-          <w:bCs/>
-        </w:rPr>
-        <w:t>Lei Federal nº 8.078/1990 (Código de Defesa do Consumidor)</w:t>
-      </w:r>
-      <w:r>
-        <w:t>.</w:t>
-      </w:r>
-    </w:p>
-    <w:p>
-      <w:pPr>
-        <w:numPr>
-          <w:ilvl w:val="0"/>
-          <w:numId w:val="4"/>
-        </w:numPr>
-        <w:spacing w:after="0"/>
-      </w:pPr>
-      <w:r>
-        <w:rPr>
-          <w:b/>
-          <w:bCs/>
-        </w:rPr>
-        <w:t>A Norma:</w:t>
-      </w:r>
-      <w:r>
-        <w:t xml:space="preserve"> O Art. 42 proíbe a exposição ao ridículo, o constrangimento ou a ameaça.</w:t>
-      </w:r>
-    </w:p>
-    <w:p>
-      <w:pPr>
-        <w:numPr>
-          <w:ilvl w:val="0"/>
-          <w:numId w:val="4"/>
-        </w:numPr>
-        <w:spacing w:after="0"/>
-      </w:pPr>
-      <w:r>
-        <w:rPr>
-          <w:b/>
-          <w:bCs/>
-        </w:rPr>
-        <w:t>Aplicação ao Stalking:</w:t>
-      </w:r>
-      <w:r>
-        <w:t xml:space="preserve"> O uso de algoritmos para chamadas incessantes fere o princípio da </w:t>
-      </w:r>
-      <w:r>
-        <w:rPr>
-          <w:b/>
-          <w:bCs/>
-        </w:rPr>
-        <w:t>Dignidade da Pessoa Humana (Art. 1º, III da CF/88)</w:t>
-      </w:r>
-      <w:r>
-        <w:t xml:space="preserve"> e o direito à </w:t>
-      </w:r>
-      <w:r>
-        <w:rPr>
-          <w:b/>
-          <w:bCs/>
-        </w:rPr>
-        <w:t>Privacidade (Art. 5º, X da CF/88)</w:t>
-      </w:r>
-      <w:r>
-        <w:t>.</w:t>
-      </w:r>
-    </w:p>
-    <w:p>
-      <w:pPr>
-        <w:spacing w:after="0"/>
-        <w:rPr>
-          <w:b/>
-          <w:bCs/>
-        </w:rPr>
-      </w:pPr>
-      <w:r>
-        <w:rPr>
-          <w:b/>
-          <w:bCs/>
-        </w:rPr>
-        <w:t>2. Normas Infralegais: Bloqueios e Horários</w:t>
-      </w:r>
-    </w:p>
-    <w:p>
-      <w:pPr>
-        <w:spacing w:after="0"/>
-      </w:pPr>
-      <w:r>
-        <w:t xml:space="preserve">Para reforçar a tese de "Abuso de Direito", o artigo se ancora nas diretrizes da </w:t>
-      </w:r>
-      <w:r>
-        <w:rPr>
-          <w:b/>
-          <w:bCs/>
-        </w:rPr>
-        <w:t>ANATEL</w:t>
-      </w:r>
-      <w:r>
-        <w:t xml:space="preserve"> e do </w:t>
-      </w:r>
-      <w:r>
-        <w:rPr>
-          <w:b/>
-          <w:bCs/>
-        </w:rPr>
-        <w:t>Sistema de Autorregulação Bancária (SARB 018/2017 da FEBRABAN)</w:t>
-      </w:r>
-      <w:r>
-        <w:t>:</w:t>
-      </w:r>
-    </w:p>
-    <w:p>
-      <w:pPr>
-        <w:numPr>
-          <w:ilvl w:val="0"/>
-          <w:numId w:val="5"/>
-        </w:numPr>
-        <w:spacing w:after="0"/>
-      </w:pPr>
-      <w:r>
-        <w:rPr>
-          <w:b/>
-          <w:bCs/>
-        </w:rPr>
-        <w:t>Não Me Perturbe:</w:t>
-      </w:r>
-      <w:r>
-        <w:t xml:space="preserve"> O desrespeito ao cadastro de bloqueio configura descumprimento de norma regulatória, servindo como indício de má-fé da instituição.</w:t>
-      </w:r>
-    </w:p>
-    <w:p>
-      <w:pPr>
-        <w:numPr>
-          <w:ilvl w:val="0"/>
-          <w:numId w:val="5"/>
-        </w:numPr>
-        <w:spacing w:after="0"/>
-      </w:pPr>
-      <w:r>
-        <w:rPr>
-          <w:b/>
-          <w:bCs/>
-        </w:rPr>
-        <w:t>Horários de Cobrança:</w:t>
-      </w:r>
-      <w:r>
-        <w:t xml:space="preserve"> A jurisprudência utiliza leis estaduais (como a Lei 13.226/08 de SP) para balizar horários aceitáveis, considerando "constrangimento" ligações em horários de repouso ou repetitividade extrema.</w:t>
-      </w:r>
-    </w:p>
-    <w:p>
-      <w:pPr>
-        <w:spacing w:after="0"/>
-        <w:rPr>
-          <w:b/>
-          <w:bCs/>
-        </w:rPr>
-      </w:pPr>
-      <w:r>
-        <w:rPr>
-          <w:b/>
-          <w:bCs/>
-        </w:rPr>
-        <w:t>3. Jurisprudência: O Entendimento dos Tribunais</w:t>
-      </w:r>
-    </w:p>
-    <w:p>
-      <w:pPr>
-        <w:spacing w:after="0"/>
-      </w:pPr>
-      <w:r>
-        <w:t xml:space="preserve">O conteúdo foi validado para não prometer resultados incertos, mas para refletir o que o </w:t>
-      </w:r>
-      <w:r>
-        <w:rPr>
-          <w:b/>
-          <w:bCs/>
-        </w:rPr>
-        <w:t>STJ</w:t>
-      </w:r>
-      <w:r>
-        <w:t xml:space="preserve"> e os </w:t>
-      </w:r>
-      <w:proofErr w:type="spellStart"/>
-      <w:r>
-        <w:rPr>
-          <w:b/>
-          <w:bCs/>
-        </w:rPr>
-        <w:t>TJs</w:t>
-      </w:r>
-      <w:proofErr w:type="spellEnd"/>
-      <w:r>
-        <w:t xml:space="preserve"> decidem:</w:t>
-      </w:r>
-    </w:p>
-    <w:p>
-      <w:pPr>
-        <w:numPr>
-          <w:ilvl w:val="0"/>
-          <w:numId w:val="6"/>
-        </w:numPr>
-        <w:spacing w:after="0"/>
-      </w:pPr>
-      <w:r>
-        <w:rPr>
-          <w:b/>
-          <w:bCs/>
-        </w:rPr>
-        <w:t xml:space="preserve">Dano Moral In Re </w:t>
-      </w:r>
-      <w:proofErr w:type="spellStart"/>
-      <w:r>
-        <w:rPr>
-          <w:b/>
-          <w:bCs/>
-        </w:rPr>
-        <w:t>Ipsa</w:t>
-      </w:r>
-      <w:proofErr w:type="spellEnd"/>
-      <w:r>
-        <w:rPr>
-          <w:b/>
-          <w:bCs/>
-        </w:rPr>
-        <w:t xml:space="preserve"> vs. Provado:</w:t>
-      </w:r>
-      <w:r>
-        <w:t xml:space="preserve"> Embora existam decisões variadas, a jurisprudência majoritária entende que o </w:t>
-      </w:r>
-      <w:r>
-        <w:rPr>
-          <w:b/>
-          <w:bCs/>
-        </w:rPr>
-        <w:t>Stalking Bancário</w:t>
-      </w:r>
-      <w:r>
-        <w:t xml:space="preserve"> (perseguição obsessiva) ultrapassa o "mero aborrecimento" quando há prova da frequência (logs).</w:t>
-      </w:r>
-    </w:p>
-    <w:p>
-      <w:pPr>
-        <w:numPr>
-          <w:ilvl w:val="0"/>
-          <w:numId w:val="6"/>
-        </w:numPr>
-        <w:spacing w:after="0"/>
-      </w:pPr>
-      <w:r>
-        <w:rPr>
-          <w:b/>
-          <w:bCs/>
-        </w:rPr>
-        <w:t>Teoria do Desvio Produtivo do Consumidor:</w:t>
-      </w:r>
-      <w:r>
-        <w:t xml:space="preserve"> O texto se alinha a esta tese moderna, onde o tempo que o consumidor perde tentando interromper o assédio é passível de indenização.</w:t>
-      </w:r>
-    </w:p>
-    <w:p>
-      <w:pPr>
-        <w:spacing w:after="0"/>
-        <w:rPr>
-          <w:b/>
-          <w:bCs/>
-        </w:rPr>
-      </w:pPr>
-      <w:r>
-        <w:rPr>
-          <w:b/>
-          <w:bCs/>
-        </w:rPr>
-        <w:t>4. Diligência na Prova Técnica (Engenharia de Dados)</w:t>
-      </w:r>
-    </w:p>
-    <w:p>
-      <w:pPr>
-        <w:spacing w:after="0"/>
-      </w:pPr>
-      <w:r>
-        <w:t xml:space="preserve">A parte de </w:t>
-      </w:r>
-      <w:r>
-        <w:rPr>
-          <w:b/>
-          <w:bCs/>
-        </w:rPr>
-        <w:t>Análise de Logs</w:t>
-      </w:r>
-      <w:r>
-        <w:t xml:space="preserve"> segue os preceitos da </w:t>
-      </w:r>
-      <w:r>
-        <w:rPr>
-          <w:b/>
-          <w:bCs/>
-        </w:rPr>
-        <w:t>ISO/IEC 27037</w:t>
-      </w:r>
-      <w:r>
-        <w:t xml:space="preserve"> (Diretrizes para identificação, coleta, aquisição e preservação de evidência digital):</w:t>
-      </w:r>
-    </w:p>
-    <w:p>
-      <w:pPr>
-        <w:numPr>
-          <w:ilvl w:val="0"/>
-          <w:numId w:val="7"/>
-        </w:numPr>
-        <w:spacing w:after="0"/>
-      </w:pPr>
-      <w:r>
-        <w:rPr>
-          <w:b/>
-          <w:bCs/>
-        </w:rPr>
-        <w:t>Cadeia de Custódia:</w:t>
-      </w:r>
-      <w:r>
-        <w:t xml:space="preserve"> Ao orientar a não apagar o histórico e fazer prints estratégicos, o artigo preserva a integridade da prova para futura perícia judicial.</w:t>
-      </w:r>
-    </w:p>
-    <w:p>
-      <w:pPr>
-        <w:numPr>
-          <w:ilvl w:val="0"/>
-          <w:numId w:val="7"/>
-        </w:numPr>
-        <w:spacing w:after="0"/>
-      </w:pPr>
-      <w:r>
-        <w:rPr>
-          <w:b/>
-          <w:bCs/>
-        </w:rPr>
-        <w:t>Identificação de Discadores Preditivos:</w:t>
-      </w:r>
-      <w:r>
-        <w:t xml:space="preserve"> Tecnicamente, a prova da "Inviabilidade Humana" (volume de chamadas impossível de ser feito por uma única pessoa) é o que sustenta a tese de "Assédio Algorítmico" nos tribunais.</w:t>
-      </w:r>
-    </w:p>
-    <w:p>
-      <w:pPr>
-        <w:spacing w:after="0"/>
-        <w:rPr>
-          <w:b/>
-          <w:bCs/>
-        </w:rPr>
-      </w:pPr>
-      <w:r>
-        <w:rPr>
-          <w:b/>
-          <w:bCs/>
-        </w:rPr>
-        <w:t>5. Revisão de Terminologia</w:t>
-      </w:r>
-    </w:p>
-    <w:p>
-      <w:pPr>
-        <w:numPr>
-          <w:ilvl w:val="0"/>
-          <w:numId w:val="8"/>
-        </w:numPr>
-        <w:spacing w:after="0"/>
-      </w:pPr>
-      <w:r>
-        <w:rPr>
-          <w:b/>
-          <w:bCs/>
-        </w:rPr>
-        <w:t>Substituição:</w:t>
-      </w:r>
-      <w:r>
-        <w:t xml:space="preserve"> Evitamos termos como "crime de </w:t>
-      </w:r>
-      <w:proofErr w:type="spellStart"/>
-      <w:r>
-        <w:t>stalking</w:t>
-      </w:r>
-      <w:proofErr w:type="spellEnd"/>
-      <w:r>
-        <w:t xml:space="preserve">" (que exigiria dolo específico do Art. 147-A do CP) e focamos na </w:t>
-      </w:r>
-      <w:r>
-        <w:rPr>
-          <w:b/>
-          <w:bCs/>
-        </w:rPr>
-        <w:t>Ilícito Civil por Abuso de Direito (Art. 187 do Código Civil)</w:t>
-      </w:r>
-      <w:r>
-        <w:t>, que é a via mais sólida para indenizações contra bancos.</w:t>
-      </w:r>
-    </w:p>
-    <w:p>
-      <w:pPr>
-        <w:spacing w:after="0"/>
-      </w:pPr>
-      <w:r>
-        <w:rPr>
-          <w:b/>
-          <w:bCs/>
-        </w:rPr>
-        <w:t>Veredito de Lisura:</w:t>
-      </w:r>
-      <w:r>
-        <w:t xml:space="preserve"> O conteúdo é diligente, não inventa regras e utiliza a Engenharia de Dados como ferramenta de aplicação do Direito. O artigo está apto a ser publicado como um documento técnico-jurídico de alta confiabilidade.</w:t>
-      </w:r>
-    </w:p>
-    <w:p>
-      <w:pPr>
-        <w:spacing w:after="0"/>
-      </w:pPr>
     </w:p>
     <w:sectPr>
       <w:pgSz w:w="11906" w:h="16838"/>
@@ -909,9 +395,9 @@
 <file path=word/numbering.xml><?xml version="1.0" encoding="utf-8"?>
 <w:numbering xmlns:wpc="http://schemas.microsoft.com/office/word/2010/wordprocessingCanvas" xmlns:cx="http://schemas.microsoft.com/office/drawing/2014/chartex" xmlns:cx1="http://schemas.microsoft.com/office/drawing/2015/9/8/chartex" xmlns:cx2="http://schemas.microsoft.com/office/drawing/2015/10/21/chartex" xmlns:cx3="http://schemas.microsoft.com/office/drawing/2016/5/9/chartex" xmlns:cx4="http://schemas.microsoft.com/office/drawing/2016/5/10/chartex" xmlns:cx5="http://schemas.microsoft.com/office/drawing/2016/5/11/chartex" xmlns:cx6="http://schemas.microsoft.com/office/drawing/2016/5/12/chartex" xmlns:cx7="http://schemas.microsoft.com/office/drawing/2016/5/13/chartex" xmlns:cx8="http://schemas.microsoft.com/office/drawing/2016/5/14/chartex" xmlns:mc="http://schemas.openxmlformats.org/markup-compatibility/2006" xmlns:aink="http://schemas.microsoft.com/office/drawing/2016/ink" xmlns:am3d="http://schemas.microsoft.com/office/drawing/2017/model3d" xmlns:o="urn:schemas-microsoft-com:office:office" xmlns:oel="http://schemas.microsoft.com/office/2019/extlst" xmlns:r="http://schemas.openxmlformats.org/officeDocument/2006/relationships" xmlns:m="http://schemas.openxmlformats.org/officeDocument/2006/math" xmlns:v="urn:schemas-microsoft-com:vml" xmlns:wp14="http://schemas.microsoft.com/office/word/2010/wordprocessingDrawing" xmlns:wp="http://schemas.openxmlformats.org/drawingml/2006/wordprocessingDrawing" xmlns:w10="urn:schemas-microsoft-com:office:word" xmlns:w="http://schemas.openxmlformats.org/wordprocessingml/2006/main" xmlns:w14="http://schemas.microsoft.com/office/word/2010/wordml" xmlns:w15="http://schemas.microsoft.com/office/word/2012/wordml" xmlns:w16cex="http://schemas.microsoft.com/office/word/2018/wordml/cex" xmlns:w16cid="http://schemas.microsoft.com/office/word/2016/wordml/cid" xmlns:w16="http://schemas.microsoft.com/office/word/2018/wordml" xmlns:w16du="http://schemas.microsoft.com/office/word/2023/wordml/word16du" xmlns:w16sdtdh="http://schemas.microsoft.com/office/word/2020/wordml/sdtdatahash" xmlns:w16sdtfl="http://schemas.microsoft.com/office/word/2024/wordml/sdtformatlock" xmlns:w16se="http://schemas.microsoft.com/office/word/2015/wordml/symex" xmlns:wpg="http://schemas.microsoft.com/office/word/2010/wordprocessingGroup" xmlns:wpi="http://schemas.microsoft.com/office/word/2010/wordprocessingInk" xmlns:wne="http://schemas.microsoft.com/office/word/2006/wordml" xmlns:wps="http://schemas.microsoft.com/office/word/2010/wordprocessingShape" mc:Ignorable="w14 w15 w16se w16cid w16 w16cex w16sdtdh w16sdtfl w16du wp14">
   <w:abstractNum w:abstractNumId="0" w15:restartNumberingAfterBreak="0">
-    <w:nsid w:val="0B5A3211"/>
+    <w:nsid w:val="0F88127A"/>
     <w:multiLevelType w:val="multilevel"/>
-    <w:tmpl w:val="0428C984"/>
+    <w:tmpl w:val="21AC0A68"/>
     <w:lvl w:ilvl="0">
       <w:start w:val="1"/>
       <w:numFmt w:val="bullet"/>
@@ -1058,9 +544,122 @@
     </w:lvl>
   </w:abstractNum>
   <w:abstractNum w:abstractNumId="1" w15:restartNumberingAfterBreak="0">
-    <w:nsid w:val="0F88127A"/>
+    <w:nsid w:val="46A311A0"/>
     <w:multiLevelType w:val="multilevel"/>
-    <w:tmpl w:val="21AC0A68"/>
+    <w:tmpl w:val="9A202D66"/>
+    <w:lvl w:ilvl="0">
+      <w:start w:val="1"/>
+      <w:numFmt w:val="decimal"/>
+      <w:lvlText w:val="%1."/>
+      <w:lvlJc w:val="left"/>
+      <w:pPr>
+        <w:tabs>
+          <w:tab w:val="num" w:pos="720"/>
+        </w:tabs>
+        <w:ind w:left="720" w:hanging="360"/>
+      </w:pPr>
+    </w:lvl>
+    <w:lvl w:ilvl="1" w:tentative="1">
+      <w:start w:val="1"/>
+      <w:numFmt w:val="decimal"/>
+      <w:lvlText w:val="%2."/>
+      <w:lvlJc w:val="left"/>
+      <w:pPr>
+        <w:tabs>
+          <w:tab w:val="num" w:pos="1440"/>
+        </w:tabs>
+        <w:ind w:left="1440" w:hanging="360"/>
+      </w:pPr>
+    </w:lvl>
+    <w:lvl w:ilvl="2" w:tentative="1">
+      <w:start w:val="1"/>
+      <w:numFmt w:val="decimal"/>
+      <w:lvlText w:val="%3."/>
+      <w:lvlJc w:val="left"/>
+      <w:pPr>
+        <w:tabs>
+          <w:tab w:val="num" w:pos="2160"/>
+        </w:tabs>
+        <w:ind w:left="2160" w:hanging="360"/>
+      </w:pPr>
+    </w:lvl>
+    <w:lvl w:ilvl="3" w:tentative="1">
+      <w:start w:val="1"/>
+      <w:numFmt w:val="decimal"/>
+      <w:lvlText w:val="%4."/>
+      <w:lvlJc w:val="left"/>
+      <w:pPr>
+        <w:tabs>
+          <w:tab w:val="num" w:pos="2880"/>
+        </w:tabs>
+        <w:ind w:left="2880" w:hanging="360"/>
+      </w:pPr>
+    </w:lvl>
+    <w:lvl w:ilvl="4" w:tentative="1">
+      <w:start w:val="1"/>
+      <w:numFmt w:val="decimal"/>
+      <w:lvlText w:val="%5."/>
+      <w:lvlJc w:val="left"/>
+      <w:pPr>
+        <w:tabs>
+          <w:tab w:val="num" w:pos="3600"/>
+        </w:tabs>
+        <w:ind w:left="3600" w:hanging="360"/>
+      </w:pPr>
+    </w:lvl>
+    <w:lvl w:ilvl="5" w:tentative="1">
+      <w:start w:val="1"/>
+      <w:numFmt w:val="decimal"/>
+      <w:lvlText w:val="%6."/>
+      <w:lvlJc w:val="left"/>
+      <w:pPr>
+        <w:tabs>
+          <w:tab w:val="num" w:pos="4320"/>
+        </w:tabs>
+        <w:ind w:left="4320" w:hanging="360"/>
+      </w:pPr>
+    </w:lvl>
+    <w:lvl w:ilvl="6" w:tentative="1">
+      <w:start w:val="1"/>
+      <w:numFmt w:val="decimal"/>
+      <w:lvlText w:val="%7."/>
+      <w:lvlJc w:val="left"/>
+      <w:pPr>
+        <w:tabs>
+          <w:tab w:val="num" w:pos="5040"/>
+        </w:tabs>
+        <w:ind w:left="5040" w:hanging="360"/>
+      </w:pPr>
+    </w:lvl>
+    <w:lvl w:ilvl="7" w:tentative="1">
+      <w:start w:val="1"/>
+      <w:numFmt w:val="decimal"/>
+      <w:lvlText w:val="%8."/>
+      <w:lvlJc w:val="left"/>
+      <w:pPr>
+        <w:tabs>
+          <w:tab w:val="num" w:pos="5760"/>
+        </w:tabs>
+        <w:ind w:left="5760" w:hanging="360"/>
+      </w:pPr>
+    </w:lvl>
+    <w:lvl w:ilvl="8" w:tentative="1">
+      <w:start w:val="1"/>
+      <w:numFmt w:val="decimal"/>
+      <w:lvlText w:val="%9."/>
+      <w:lvlJc w:val="left"/>
+      <w:pPr>
+        <w:tabs>
+          <w:tab w:val="num" w:pos="6480"/>
+        </w:tabs>
+        <w:ind w:left="6480" w:hanging="360"/>
+      </w:pPr>
+    </w:lvl>
+  </w:abstractNum>
+  <w:abstractNum w:abstractNumId="2" w15:restartNumberingAfterBreak="0">
+    <w:nsid w:val="52A248D8"/>
+    <w:multiLevelType w:val="multilevel"/>
+    <w:tmpl w:val="A2FC116C"/>
     <w:lvl w:ilvl="0">
       <w:start w:val="1"/>
       <w:numFmt w:val="bullet"/>
@@ -1206,887 +805,14 @@
       </w:rPr>
     </w:lvl>
   </w:abstractNum>
-  <w:abstractNum w:abstractNumId="2" w15:restartNumberingAfterBreak="0">
-    <w:nsid w:val="27867296"/>
-    <w:multiLevelType w:val="multilevel"/>
-    <w:tmpl w:val="78CEE444"/>
-    <w:lvl w:ilvl="0">
-      <w:start w:val="1"/>
-      <w:numFmt w:val="bullet"/>
-      <w:lvlText w:val=""/>
-      <w:lvlJc w:val="left"/>
-      <w:pPr>
-        <w:tabs>
-          <w:tab w:val="num" w:pos="720"/>
-        </w:tabs>
-        <w:ind w:left="720" w:hanging="360"/>
-      </w:pPr>
-      <w:rPr>
-        <w:rFonts w:ascii="Symbol" w:hAnsi="Symbol" w:hint="default"/>
-        <w:sz w:val="20"/>
-      </w:rPr>
-    </w:lvl>
-    <w:lvl w:ilvl="1" w:tentative="1">
-      <w:start w:val="1"/>
-      <w:numFmt w:val="bullet"/>
-      <w:lvlText w:val="o"/>
-      <w:lvlJc w:val="left"/>
-      <w:pPr>
-        <w:tabs>
-          <w:tab w:val="num" w:pos="1440"/>
-        </w:tabs>
-        <w:ind w:left="1440" w:hanging="360"/>
-      </w:pPr>
-      <w:rPr>
-        <w:rFonts w:ascii="Courier New" w:hAnsi="Courier New" w:hint="default"/>
-        <w:sz w:val="20"/>
-      </w:rPr>
-    </w:lvl>
-    <w:lvl w:ilvl="2" w:tentative="1">
-      <w:start w:val="1"/>
-      <w:numFmt w:val="bullet"/>
-      <w:lvlText w:val=""/>
-      <w:lvlJc w:val="left"/>
-      <w:pPr>
-        <w:tabs>
-          <w:tab w:val="num" w:pos="2160"/>
-        </w:tabs>
-        <w:ind w:left="2160" w:hanging="360"/>
-      </w:pPr>
-      <w:rPr>
-        <w:rFonts w:ascii="Wingdings" w:hAnsi="Wingdings" w:hint="default"/>
-        <w:sz w:val="20"/>
-      </w:rPr>
-    </w:lvl>
-    <w:lvl w:ilvl="3" w:tentative="1">
-      <w:start w:val="1"/>
-      <w:numFmt w:val="bullet"/>
-      <w:lvlText w:val=""/>
-      <w:lvlJc w:val="left"/>
-      <w:pPr>
-        <w:tabs>
-          <w:tab w:val="num" w:pos="2880"/>
-        </w:tabs>
-        <w:ind w:left="2880" w:hanging="360"/>
-      </w:pPr>
-      <w:rPr>
-        <w:rFonts w:ascii="Wingdings" w:hAnsi="Wingdings" w:hint="default"/>
-        <w:sz w:val="20"/>
-      </w:rPr>
-    </w:lvl>
-    <w:lvl w:ilvl="4" w:tentative="1">
-      <w:start w:val="1"/>
-      <w:numFmt w:val="bullet"/>
-      <w:lvlText w:val=""/>
-      <w:lvlJc w:val="left"/>
-      <w:pPr>
-        <w:tabs>
-          <w:tab w:val="num" w:pos="3600"/>
-        </w:tabs>
-        <w:ind w:left="3600" w:hanging="360"/>
-      </w:pPr>
-      <w:rPr>
-        <w:rFonts w:ascii="Wingdings" w:hAnsi="Wingdings" w:hint="default"/>
-        <w:sz w:val="20"/>
-      </w:rPr>
-    </w:lvl>
-    <w:lvl w:ilvl="5" w:tentative="1">
-      <w:start w:val="1"/>
-      <w:numFmt w:val="bullet"/>
-      <w:lvlText w:val=""/>
-      <w:lvlJc w:val="left"/>
-      <w:pPr>
-        <w:tabs>
-          <w:tab w:val="num" w:pos="4320"/>
-        </w:tabs>
-        <w:ind w:left="4320" w:hanging="360"/>
-      </w:pPr>
-      <w:rPr>
-        <w:rFonts w:ascii="Wingdings" w:hAnsi="Wingdings" w:hint="default"/>
-        <w:sz w:val="20"/>
-      </w:rPr>
-    </w:lvl>
-    <w:lvl w:ilvl="6" w:tentative="1">
-      <w:start w:val="1"/>
-      <w:numFmt w:val="bullet"/>
-      <w:lvlText w:val=""/>
-      <w:lvlJc w:val="left"/>
-      <w:pPr>
-        <w:tabs>
-          <w:tab w:val="num" w:pos="5040"/>
-        </w:tabs>
-        <w:ind w:left="5040" w:hanging="360"/>
-      </w:pPr>
-      <w:rPr>
-        <w:rFonts w:ascii="Wingdings" w:hAnsi="Wingdings" w:hint="default"/>
-        <w:sz w:val="20"/>
-      </w:rPr>
-    </w:lvl>
-    <w:lvl w:ilvl="7" w:tentative="1">
-      <w:start w:val="1"/>
-      <w:numFmt w:val="bullet"/>
-      <w:lvlText w:val=""/>
-      <w:lvlJc w:val="left"/>
-      <w:pPr>
-        <w:tabs>
-          <w:tab w:val="num" w:pos="5760"/>
-        </w:tabs>
-        <w:ind w:left="5760" w:hanging="360"/>
-      </w:pPr>
-      <w:rPr>
-        <w:rFonts w:ascii="Wingdings" w:hAnsi="Wingdings" w:hint="default"/>
-        <w:sz w:val="20"/>
-      </w:rPr>
-    </w:lvl>
-    <w:lvl w:ilvl="8" w:tentative="1">
-      <w:start w:val="1"/>
-      <w:numFmt w:val="bullet"/>
-      <w:lvlText w:val=""/>
-      <w:lvlJc w:val="left"/>
-      <w:pPr>
-        <w:tabs>
-          <w:tab w:val="num" w:pos="6480"/>
-        </w:tabs>
-        <w:ind w:left="6480" w:hanging="360"/>
-      </w:pPr>
-      <w:rPr>
-        <w:rFonts w:ascii="Wingdings" w:hAnsi="Wingdings" w:hint="default"/>
-        <w:sz w:val="20"/>
-      </w:rPr>
-    </w:lvl>
-  </w:abstractNum>
-  <w:abstractNum w:abstractNumId="3" w15:restartNumberingAfterBreak="0">
-    <w:nsid w:val="2B4D678C"/>
-    <w:multiLevelType w:val="multilevel"/>
-    <w:tmpl w:val="7F042036"/>
-    <w:lvl w:ilvl="0">
-      <w:start w:val="1"/>
-      <w:numFmt w:val="bullet"/>
-      <w:lvlText w:val=""/>
-      <w:lvlJc w:val="left"/>
-      <w:pPr>
-        <w:tabs>
-          <w:tab w:val="num" w:pos="720"/>
-        </w:tabs>
-        <w:ind w:left="720" w:hanging="360"/>
-      </w:pPr>
-      <w:rPr>
-        <w:rFonts w:ascii="Symbol" w:hAnsi="Symbol" w:hint="default"/>
-        <w:sz w:val="20"/>
-      </w:rPr>
-    </w:lvl>
-    <w:lvl w:ilvl="1" w:tentative="1">
-      <w:start w:val="1"/>
-      <w:numFmt w:val="bullet"/>
-      <w:lvlText w:val="o"/>
-      <w:lvlJc w:val="left"/>
-      <w:pPr>
-        <w:tabs>
-          <w:tab w:val="num" w:pos="1440"/>
-        </w:tabs>
-        <w:ind w:left="1440" w:hanging="360"/>
-      </w:pPr>
-      <w:rPr>
-        <w:rFonts w:ascii="Courier New" w:hAnsi="Courier New" w:hint="default"/>
-        <w:sz w:val="20"/>
-      </w:rPr>
-    </w:lvl>
-    <w:lvl w:ilvl="2" w:tentative="1">
-      <w:start w:val="1"/>
-      <w:numFmt w:val="bullet"/>
-      <w:lvlText w:val=""/>
-      <w:lvlJc w:val="left"/>
-      <w:pPr>
-        <w:tabs>
-          <w:tab w:val="num" w:pos="2160"/>
-        </w:tabs>
-        <w:ind w:left="2160" w:hanging="360"/>
-      </w:pPr>
-      <w:rPr>
-        <w:rFonts w:ascii="Wingdings" w:hAnsi="Wingdings" w:hint="default"/>
-        <w:sz w:val="20"/>
-      </w:rPr>
-    </w:lvl>
-    <w:lvl w:ilvl="3" w:tentative="1">
-      <w:start w:val="1"/>
-      <w:numFmt w:val="bullet"/>
-      <w:lvlText w:val=""/>
-      <w:lvlJc w:val="left"/>
-      <w:pPr>
-        <w:tabs>
-          <w:tab w:val="num" w:pos="2880"/>
-        </w:tabs>
-        <w:ind w:left="2880" w:hanging="360"/>
-      </w:pPr>
-      <w:rPr>
-        <w:rFonts w:ascii="Wingdings" w:hAnsi="Wingdings" w:hint="default"/>
-        <w:sz w:val="20"/>
-      </w:rPr>
-    </w:lvl>
-    <w:lvl w:ilvl="4" w:tentative="1">
-      <w:start w:val="1"/>
-      <w:numFmt w:val="bullet"/>
-      <w:lvlText w:val=""/>
-      <w:lvlJc w:val="left"/>
-      <w:pPr>
-        <w:tabs>
-          <w:tab w:val="num" w:pos="3600"/>
-        </w:tabs>
-        <w:ind w:left="3600" w:hanging="360"/>
-      </w:pPr>
-      <w:rPr>
-        <w:rFonts w:ascii="Wingdings" w:hAnsi="Wingdings" w:hint="default"/>
-        <w:sz w:val="20"/>
-      </w:rPr>
-    </w:lvl>
-    <w:lvl w:ilvl="5" w:tentative="1">
-      <w:start w:val="1"/>
-      <w:numFmt w:val="bullet"/>
-      <w:lvlText w:val=""/>
-      <w:lvlJc w:val="left"/>
-      <w:pPr>
-        <w:tabs>
-          <w:tab w:val="num" w:pos="4320"/>
-        </w:tabs>
-        <w:ind w:left="4320" w:hanging="360"/>
-      </w:pPr>
-      <w:rPr>
-        <w:rFonts w:ascii="Wingdings" w:hAnsi="Wingdings" w:hint="default"/>
-        <w:sz w:val="20"/>
-      </w:rPr>
-    </w:lvl>
-    <w:lvl w:ilvl="6" w:tentative="1">
-      <w:start w:val="1"/>
-      <w:numFmt w:val="bullet"/>
-      <w:lvlText w:val=""/>
-      <w:lvlJc w:val="left"/>
-      <w:pPr>
-        <w:tabs>
-          <w:tab w:val="num" w:pos="5040"/>
-        </w:tabs>
-        <w:ind w:left="5040" w:hanging="360"/>
-      </w:pPr>
-      <w:rPr>
-        <w:rFonts w:ascii="Wingdings" w:hAnsi="Wingdings" w:hint="default"/>
-        <w:sz w:val="20"/>
-      </w:rPr>
-    </w:lvl>
-    <w:lvl w:ilvl="7" w:tentative="1">
-      <w:start w:val="1"/>
-      <w:numFmt w:val="bullet"/>
-      <w:lvlText w:val=""/>
-      <w:lvlJc w:val="left"/>
-      <w:pPr>
-        <w:tabs>
-          <w:tab w:val="num" w:pos="5760"/>
-        </w:tabs>
-        <w:ind w:left="5760" w:hanging="360"/>
-      </w:pPr>
-      <w:rPr>
-        <w:rFonts w:ascii="Wingdings" w:hAnsi="Wingdings" w:hint="default"/>
-        <w:sz w:val="20"/>
-      </w:rPr>
-    </w:lvl>
-    <w:lvl w:ilvl="8" w:tentative="1">
-      <w:start w:val="1"/>
-      <w:numFmt w:val="bullet"/>
-      <w:lvlText w:val=""/>
-      <w:lvlJc w:val="left"/>
-      <w:pPr>
-        <w:tabs>
-          <w:tab w:val="num" w:pos="6480"/>
-        </w:tabs>
-        <w:ind w:left="6480" w:hanging="360"/>
-      </w:pPr>
-      <w:rPr>
-        <w:rFonts w:ascii="Wingdings" w:hAnsi="Wingdings" w:hint="default"/>
-        <w:sz w:val="20"/>
-      </w:rPr>
-    </w:lvl>
-  </w:abstractNum>
-  <w:abstractNum w:abstractNumId="4" w15:restartNumberingAfterBreak="0">
-    <w:nsid w:val="46A311A0"/>
-    <w:multiLevelType w:val="multilevel"/>
-    <w:tmpl w:val="9A202D66"/>
-    <w:lvl w:ilvl="0">
-      <w:start w:val="1"/>
-      <w:numFmt w:val="decimal"/>
-      <w:lvlText w:val="%1."/>
-      <w:lvlJc w:val="left"/>
-      <w:pPr>
-        <w:tabs>
-          <w:tab w:val="num" w:pos="720"/>
-        </w:tabs>
-        <w:ind w:left="720" w:hanging="360"/>
-      </w:pPr>
-    </w:lvl>
-    <w:lvl w:ilvl="1" w:tentative="1">
-      <w:start w:val="1"/>
-      <w:numFmt w:val="decimal"/>
-      <w:lvlText w:val="%2."/>
-      <w:lvlJc w:val="left"/>
-      <w:pPr>
-        <w:tabs>
-          <w:tab w:val="num" w:pos="1440"/>
-        </w:tabs>
-        <w:ind w:left="1440" w:hanging="360"/>
-      </w:pPr>
-    </w:lvl>
-    <w:lvl w:ilvl="2" w:tentative="1">
-      <w:start w:val="1"/>
-      <w:numFmt w:val="decimal"/>
-      <w:lvlText w:val="%3."/>
-      <w:lvlJc w:val="left"/>
-      <w:pPr>
-        <w:tabs>
-          <w:tab w:val="num" w:pos="2160"/>
-        </w:tabs>
-        <w:ind w:left="2160" w:hanging="360"/>
-      </w:pPr>
-    </w:lvl>
-    <w:lvl w:ilvl="3" w:tentative="1">
-      <w:start w:val="1"/>
-      <w:numFmt w:val="decimal"/>
-      <w:lvlText w:val="%4."/>
-      <w:lvlJc w:val="left"/>
-      <w:pPr>
-        <w:tabs>
-          <w:tab w:val="num" w:pos="2880"/>
-        </w:tabs>
-        <w:ind w:left="2880" w:hanging="360"/>
-      </w:pPr>
-    </w:lvl>
-    <w:lvl w:ilvl="4" w:tentative="1">
-      <w:start w:val="1"/>
-      <w:numFmt w:val="decimal"/>
-      <w:lvlText w:val="%5."/>
-      <w:lvlJc w:val="left"/>
-      <w:pPr>
-        <w:tabs>
-          <w:tab w:val="num" w:pos="3600"/>
-        </w:tabs>
-        <w:ind w:left="3600" w:hanging="360"/>
-      </w:pPr>
-    </w:lvl>
-    <w:lvl w:ilvl="5" w:tentative="1">
-      <w:start w:val="1"/>
-      <w:numFmt w:val="decimal"/>
-      <w:lvlText w:val="%6."/>
-      <w:lvlJc w:val="left"/>
-      <w:pPr>
-        <w:tabs>
-          <w:tab w:val="num" w:pos="4320"/>
-        </w:tabs>
-        <w:ind w:left="4320" w:hanging="360"/>
-      </w:pPr>
-    </w:lvl>
-    <w:lvl w:ilvl="6" w:tentative="1">
-      <w:start w:val="1"/>
-      <w:numFmt w:val="decimal"/>
-      <w:lvlText w:val="%7."/>
-      <w:lvlJc w:val="left"/>
-      <w:pPr>
-        <w:tabs>
-          <w:tab w:val="num" w:pos="5040"/>
-        </w:tabs>
-        <w:ind w:left="5040" w:hanging="360"/>
-      </w:pPr>
-    </w:lvl>
-    <w:lvl w:ilvl="7" w:tentative="1">
-      <w:start w:val="1"/>
-      <w:numFmt w:val="decimal"/>
-      <w:lvlText w:val="%8."/>
-      <w:lvlJc w:val="left"/>
-      <w:pPr>
-        <w:tabs>
-          <w:tab w:val="num" w:pos="5760"/>
-        </w:tabs>
-        <w:ind w:left="5760" w:hanging="360"/>
-      </w:pPr>
-    </w:lvl>
-    <w:lvl w:ilvl="8" w:tentative="1">
-      <w:start w:val="1"/>
-      <w:numFmt w:val="decimal"/>
-      <w:lvlText w:val="%9."/>
-      <w:lvlJc w:val="left"/>
-      <w:pPr>
-        <w:tabs>
-          <w:tab w:val="num" w:pos="6480"/>
-        </w:tabs>
-        <w:ind w:left="6480" w:hanging="360"/>
-      </w:pPr>
-    </w:lvl>
-  </w:abstractNum>
-  <w:abstractNum w:abstractNumId="5" w15:restartNumberingAfterBreak="0">
-    <w:nsid w:val="52A248D8"/>
-    <w:multiLevelType w:val="multilevel"/>
-    <w:tmpl w:val="A2FC116C"/>
-    <w:lvl w:ilvl="0">
-      <w:start w:val="1"/>
-      <w:numFmt w:val="bullet"/>
-      <w:lvlText w:val=""/>
-      <w:lvlJc w:val="left"/>
-      <w:pPr>
-        <w:tabs>
-          <w:tab w:val="num" w:pos="720"/>
-        </w:tabs>
-        <w:ind w:left="720" w:hanging="360"/>
-      </w:pPr>
-      <w:rPr>
-        <w:rFonts w:ascii="Symbol" w:hAnsi="Symbol" w:hint="default"/>
-        <w:sz w:val="20"/>
-      </w:rPr>
-    </w:lvl>
-    <w:lvl w:ilvl="1" w:tentative="1">
-      <w:start w:val="1"/>
-      <w:numFmt w:val="bullet"/>
-      <w:lvlText w:val="o"/>
-      <w:lvlJc w:val="left"/>
-      <w:pPr>
-        <w:tabs>
-          <w:tab w:val="num" w:pos="1440"/>
-        </w:tabs>
-        <w:ind w:left="1440" w:hanging="360"/>
-      </w:pPr>
-      <w:rPr>
-        <w:rFonts w:ascii="Courier New" w:hAnsi="Courier New" w:hint="default"/>
-        <w:sz w:val="20"/>
-      </w:rPr>
-    </w:lvl>
-    <w:lvl w:ilvl="2" w:tentative="1">
-      <w:start w:val="1"/>
-      <w:numFmt w:val="bullet"/>
-      <w:lvlText w:val=""/>
-      <w:lvlJc w:val="left"/>
-      <w:pPr>
-        <w:tabs>
-          <w:tab w:val="num" w:pos="2160"/>
-        </w:tabs>
-        <w:ind w:left="2160" w:hanging="360"/>
-      </w:pPr>
-      <w:rPr>
-        <w:rFonts w:ascii="Wingdings" w:hAnsi="Wingdings" w:hint="default"/>
-        <w:sz w:val="20"/>
-      </w:rPr>
-    </w:lvl>
-    <w:lvl w:ilvl="3" w:tentative="1">
-      <w:start w:val="1"/>
-      <w:numFmt w:val="bullet"/>
-      <w:lvlText w:val=""/>
-      <w:lvlJc w:val="left"/>
-      <w:pPr>
-        <w:tabs>
-          <w:tab w:val="num" w:pos="2880"/>
-        </w:tabs>
-        <w:ind w:left="2880" w:hanging="360"/>
-      </w:pPr>
-      <w:rPr>
-        <w:rFonts w:ascii="Wingdings" w:hAnsi="Wingdings" w:hint="default"/>
-        <w:sz w:val="20"/>
-      </w:rPr>
-    </w:lvl>
-    <w:lvl w:ilvl="4" w:tentative="1">
-      <w:start w:val="1"/>
-      <w:numFmt w:val="bullet"/>
-      <w:lvlText w:val=""/>
-      <w:lvlJc w:val="left"/>
-      <w:pPr>
-        <w:tabs>
-          <w:tab w:val="num" w:pos="3600"/>
-        </w:tabs>
-        <w:ind w:left="3600" w:hanging="360"/>
-      </w:pPr>
-      <w:rPr>
-        <w:rFonts w:ascii="Wingdings" w:hAnsi="Wingdings" w:hint="default"/>
-        <w:sz w:val="20"/>
-      </w:rPr>
-    </w:lvl>
-    <w:lvl w:ilvl="5" w:tentative="1">
-      <w:start w:val="1"/>
-      <w:numFmt w:val="bullet"/>
-      <w:lvlText w:val=""/>
-      <w:lvlJc w:val="left"/>
-      <w:pPr>
-        <w:tabs>
-          <w:tab w:val="num" w:pos="4320"/>
-        </w:tabs>
-        <w:ind w:left="4320" w:hanging="360"/>
-      </w:pPr>
-      <w:rPr>
-        <w:rFonts w:ascii="Wingdings" w:hAnsi="Wingdings" w:hint="default"/>
-        <w:sz w:val="20"/>
-      </w:rPr>
-    </w:lvl>
-    <w:lvl w:ilvl="6" w:tentative="1">
-      <w:start w:val="1"/>
-      <w:numFmt w:val="bullet"/>
-      <w:lvlText w:val=""/>
-      <w:lvlJc w:val="left"/>
-      <w:pPr>
-        <w:tabs>
-          <w:tab w:val="num" w:pos="5040"/>
-        </w:tabs>
-        <w:ind w:left="5040" w:hanging="360"/>
-      </w:pPr>
-      <w:rPr>
-        <w:rFonts w:ascii="Wingdings" w:hAnsi="Wingdings" w:hint="default"/>
-        <w:sz w:val="20"/>
-      </w:rPr>
-    </w:lvl>
-    <w:lvl w:ilvl="7" w:tentative="1">
-      <w:start w:val="1"/>
-      <w:numFmt w:val="bullet"/>
-      <w:lvlText w:val=""/>
-      <w:lvlJc w:val="left"/>
-      <w:pPr>
-        <w:tabs>
-          <w:tab w:val="num" w:pos="5760"/>
-        </w:tabs>
-        <w:ind w:left="5760" w:hanging="360"/>
-      </w:pPr>
-      <w:rPr>
-        <w:rFonts w:ascii="Wingdings" w:hAnsi="Wingdings" w:hint="default"/>
-        <w:sz w:val="20"/>
-      </w:rPr>
-    </w:lvl>
-    <w:lvl w:ilvl="8" w:tentative="1">
-      <w:start w:val="1"/>
-      <w:numFmt w:val="bullet"/>
-      <w:lvlText w:val=""/>
-      <w:lvlJc w:val="left"/>
-      <w:pPr>
-        <w:tabs>
-          <w:tab w:val="num" w:pos="6480"/>
-        </w:tabs>
-        <w:ind w:left="6480" w:hanging="360"/>
-      </w:pPr>
-      <w:rPr>
-        <w:rFonts w:ascii="Wingdings" w:hAnsi="Wingdings" w:hint="default"/>
-        <w:sz w:val="20"/>
-      </w:rPr>
-    </w:lvl>
-  </w:abstractNum>
-  <w:abstractNum w:abstractNumId="6" w15:restartNumberingAfterBreak="0">
-    <w:nsid w:val="55B555E5"/>
-    <w:multiLevelType w:val="multilevel"/>
-    <w:tmpl w:val="EA9E6E58"/>
-    <w:lvl w:ilvl="0">
-      <w:start w:val="1"/>
-      <w:numFmt w:val="bullet"/>
-      <w:lvlText w:val=""/>
-      <w:lvlJc w:val="left"/>
-      <w:pPr>
-        <w:tabs>
-          <w:tab w:val="num" w:pos="720"/>
-        </w:tabs>
-        <w:ind w:left="720" w:hanging="360"/>
-      </w:pPr>
-      <w:rPr>
-        <w:rFonts w:ascii="Symbol" w:hAnsi="Symbol" w:hint="default"/>
-        <w:sz w:val="20"/>
-      </w:rPr>
-    </w:lvl>
-    <w:lvl w:ilvl="1" w:tentative="1">
-      <w:start w:val="1"/>
-      <w:numFmt w:val="bullet"/>
-      <w:lvlText w:val="o"/>
-      <w:lvlJc w:val="left"/>
-      <w:pPr>
-        <w:tabs>
-          <w:tab w:val="num" w:pos="1440"/>
-        </w:tabs>
-        <w:ind w:left="1440" w:hanging="360"/>
-      </w:pPr>
-      <w:rPr>
-        <w:rFonts w:ascii="Courier New" w:hAnsi="Courier New" w:hint="default"/>
-        <w:sz w:val="20"/>
-      </w:rPr>
-    </w:lvl>
-    <w:lvl w:ilvl="2" w:tentative="1">
-      <w:start w:val="1"/>
-      <w:numFmt w:val="bullet"/>
-      <w:lvlText w:val=""/>
-      <w:lvlJc w:val="left"/>
-      <w:pPr>
-        <w:tabs>
-          <w:tab w:val="num" w:pos="2160"/>
-        </w:tabs>
-        <w:ind w:left="2160" w:hanging="360"/>
-      </w:pPr>
-      <w:rPr>
-        <w:rFonts w:ascii="Wingdings" w:hAnsi="Wingdings" w:hint="default"/>
-        <w:sz w:val="20"/>
-      </w:rPr>
-    </w:lvl>
-    <w:lvl w:ilvl="3" w:tentative="1">
-      <w:start w:val="1"/>
-      <w:numFmt w:val="bullet"/>
-      <w:lvlText w:val=""/>
-      <w:lvlJc w:val="left"/>
-      <w:pPr>
-        <w:tabs>
-          <w:tab w:val="num" w:pos="2880"/>
-        </w:tabs>
-        <w:ind w:left="2880" w:hanging="360"/>
-      </w:pPr>
-      <w:rPr>
-        <w:rFonts w:ascii="Wingdings" w:hAnsi="Wingdings" w:hint="default"/>
-        <w:sz w:val="20"/>
-      </w:rPr>
-    </w:lvl>
-    <w:lvl w:ilvl="4" w:tentative="1">
-      <w:start w:val="1"/>
-      <w:numFmt w:val="bullet"/>
-      <w:lvlText w:val=""/>
-      <w:lvlJc w:val="left"/>
-      <w:pPr>
-        <w:tabs>
-          <w:tab w:val="num" w:pos="3600"/>
-        </w:tabs>
-        <w:ind w:left="3600" w:hanging="360"/>
-      </w:pPr>
-      <w:rPr>
-        <w:rFonts w:ascii="Wingdings" w:hAnsi="Wingdings" w:hint="default"/>
-        <w:sz w:val="20"/>
-      </w:rPr>
-    </w:lvl>
-    <w:lvl w:ilvl="5" w:tentative="1">
-      <w:start w:val="1"/>
-      <w:numFmt w:val="bullet"/>
-      <w:lvlText w:val=""/>
-      <w:lvlJc w:val="left"/>
-      <w:pPr>
-        <w:tabs>
-          <w:tab w:val="num" w:pos="4320"/>
-        </w:tabs>
-        <w:ind w:left="4320" w:hanging="360"/>
-      </w:pPr>
-      <w:rPr>
-        <w:rFonts w:ascii="Wingdings" w:hAnsi="Wingdings" w:hint="default"/>
-        <w:sz w:val="20"/>
-      </w:rPr>
-    </w:lvl>
-    <w:lvl w:ilvl="6" w:tentative="1">
-      <w:start w:val="1"/>
-      <w:numFmt w:val="bullet"/>
-      <w:lvlText w:val=""/>
-      <w:lvlJc w:val="left"/>
-      <w:pPr>
-        <w:tabs>
-          <w:tab w:val="num" w:pos="5040"/>
-        </w:tabs>
-        <w:ind w:left="5040" w:hanging="360"/>
-      </w:pPr>
-      <w:rPr>
-        <w:rFonts w:ascii="Wingdings" w:hAnsi="Wingdings" w:hint="default"/>
-        <w:sz w:val="20"/>
-      </w:rPr>
-    </w:lvl>
-    <w:lvl w:ilvl="7" w:tentative="1">
-      <w:start w:val="1"/>
-      <w:numFmt w:val="bullet"/>
-      <w:lvlText w:val=""/>
-      <w:lvlJc w:val="left"/>
-      <w:pPr>
-        <w:tabs>
-          <w:tab w:val="num" w:pos="5760"/>
-        </w:tabs>
-        <w:ind w:left="5760" w:hanging="360"/>
-      </w:pPr>
-      <w:rPr>
-        <w:rFonts w:ascii="Wingdings" w:hAnsi="Wingdings" w:hint="default"/>
-        <w:sz w:val="20"/>
-      </w:rPr>
-    </w:lvl>
-    <w:lvl w:ilvl="8" w:tentative="1">
-      <w:start w:val="1"/>
-      <w:numFmt w:val="bullet"/>
-      <w:lvlText w:val=""/>
-      <w:lvlJc w:val="left"/>
-      <w:pPr>
-        <w:tabs>
-          <w:tab w:val="num" w:pos="6480"/>
-        </w:tabs>
-        <w:ind w:left="6480" w:hanging="360"/>
-      </w:pPr>
-      <w:rPr>
-        <w:rFonts w:ascii="Wingdings" w:hAnsi="Wingdings" w:hint="default"/>
-        <w:sz w:val="20"/>
-      </w:rPr>
-    </w:lvl>
-  </w:abstractNum>
-  <w:abstractNum w:abstractNumId="7" w15:restartNumberingAfterBreak="0">
-    <w:nsid w:val="55B8442C"/>
-    <w:multiLevelType w:val="multilevel"/>
-    <w:tmpl w:val="3448FE36"/>
-    <w:lvl w:ilvl="0">
-      <w:start w:val="1"/>
-      <w:numFmt w:val="bullet"/>
-      <w:lvlText w:val=""/>
-      <w:lvlJc w:val="left"/>
-      <w:pPr>
-        <w:tabs>
-          <w:tab w:val="num" w:pos="720"/>
-        </w:tabs>
-        <w:ind w:left="720" w:hanging="360"/>
-      </w:pPr>
-      <w:rPr>
-        <w:rFonts w:ascii="Symbol" w:hAnsi="Symbol" w:hint="default"/>
-        <w:sz w:val="20"/>
-      </w:rPr>
-    </w:lvl>
-    <w:lvl w:ilvl="1" w:tentative="1">
-      <w:start w:val="1"/>
-      <w:numFmt w:val="bullet"/>
-      <w:lvlText w:val="o"/>
-      <w:lvlJc w:val="left"/>
-      <w:pPr>
-        <w:tabs>
-          <w:tab w:val="num" w:pos="1440"/>
-        </w:tabs>
-        <w:ind w:left="1440" w:hanging="360"/>
-      </w:pPr>
-      <w:rPr>
-        <w:rFonts w:ascii="Courier New" w:hAnsi="Courier New" w:hint="default"/>
-        <w:sz w:val="20"/>
-      </w:rPr>
-    </w:lvl>
-    <w:lvl w:ilvl="2" w:tentative="1">
-      <w:start w:val="1"/>
-      <w:numFmt w:val="bullet"/>
-      <w:lvlText w:val=""/>
-      <w:lvlJc w:val="left"/>
-      <w:pPr>
-        <w:tabs>
-          <w:tab w:val="num" w:pos="2160"/>
-        </w:tabs>
-        <w:ind w:left="2160" w:hanging="360"/>
-      </w:pPr>
-      <w:rPr>
-        <w:rFonts w:ascii="Wingdings" w:hAnsi="Wingdings" w:hint="default"/>
-        <w:sz w:val="20"/>
-      </w:rPr>
-    </w:lvl>
-    <w:lvl w:ilvl="3" w:tentative="1">
-      <w:start w:val="1"/>
-      <w:numFmt w:val="bullet"/>
-      <w:lvlText w:val=""/>
-      <w:lvlJc w:val="left"/>
-      <w:pPr>
-        <w:tabs>
-          <w:tab w:val="num" w:pos="2880"/>
-        </w:tabs>
-        <w:ind w:left="2880" w:hanging="360"/>
-      </w:pPr>
-      <w:rPr>
-        <w:rFonts w:ascii="Wingdings" w:hAnsi="Wingdings" w:hint="default"/>
-        <w:sz w:val="20"/>
-      </w:rPr>
-    </w:lvl>
-    <w:lvl w:ilvl="4" w:tentative="1">
-      <w:start w:val="1"/>
-      <w:numFmt w:val="bullet"/>
-      <w:lvlText w:val=""/>
-      <w:lvlJc w:val="left"/>
-      <w:pPr>
-        <w:tabs>
-          <w:tab w:val="num" w:pos="3600"/>
-        </w:tabs>
-        <w:ind w:left="3600" w:hanging="360"/>
-      </w:pPr>
-      <w:rPr>
-        <w:rFonts w:ascii="Wingdings" w:hAnsi="Wingdings" w:hint="default"/>
-        <w:sz w:val="20"/>
-      </w:rPr>
-    </w:lvl>
-    <w:lvl w:ilvl="5" w:tentative="1">
-      <w:start w:val="1"/>
-      <w:numFmt w:val="bullet"/>
-      <w:lvlText w:val=""/>
-      <w:lvlJc w:val="left"/>
-      <w:pPr>
-        <w:tabs>
-          <w:tab w:val="num" w:pos="4320"/>
-        </w:tabs>
-        <w:ind w:left="4320" w:hanging="360"/>
-      </w:pPr>
-      <w:rPr>
-        <w:rFonts w:ascii="Wingdings" w:hAnsi="Wingdings" w:hint="default"/>
-        <w:sz w:val="20"/>
-      </w:rPr>
-    </w:lvl>
-    <w:lvl w:ilvl="6" w:tentative="1">
-      <w:start w:val="1"/>
-      <w:numFmt w:val="bullet"/>
-      <w:lvlText w:val=""/>
-      <w:lvlJc w:val="left"/>
-      <w:pPr>
-        <w:tabs>
-          <w:tab w:val="num" w:pos="5040"/>
-        </w:tabs>
-        <w:ind w:left="5040" w:hanging="360"/>
-      </w:pPr>
-      <w:rPr>
-        <w:rFonts w:ascii="Wingdings" w:hAnsi="Wingdings" w:hint="default"/>
-        <w:sz w:val="20"/>
-      </w:rPr>
-    </w:lvl>
-    <w:lvl w:ilvl="7" w:tentative="1">
-      <w:start w:val="1"/>
-      <w:numFmt w:val="bullet"/>
-      <w:lvlText w:val=""/>
-      <w:lvlJc w:val="left"/>
-      <w:pPr>
-        <w:tabs>
-          <w:tab w:val="num" w:pos="5760"/>
-        </w:tabs>
-        <w:ind w:left="5760" w:hanging="360"/>
-      </w:pPr>
-      <w:rPr>
-        <w:rFonts w:ascii="Wingdings" w:hAnsi="Wingdings" w:hint="default"/>
-        <w:sz w:val="20"/>
-      </w:rPr>
-    </w:lvl>
-    <w:lvl w:ilvl="8" w:tentative="1">
-      <w:start w:val="1"/>
-      <w:numFmt w:val="bullet"/>
-      <w:lvlText w:val=""/>
-      <w:lvlJc w:val="left"/>
-      <w:pPr>
-        <w:tabs>
-          <w:tab w:val="num" w:pos="6480"/>
-        </w:tabs>
-        <w:ind w:left="6480" w:hanging="360"/>
-      </w:pPr>
-      <w:rPr>
-        <w:rFonts w:ascii="Wingdings" w:hAnsi="Wingdings" w:hint="default"/>
-        <w:sz w:val="20"/>
-      </w:rPr>
-    </w:lvl>
-  </w:abstractNum>
   <w:num w:numId="1" w16cid:durableId="1323925140">
-    <w:abstractNumId w:val="5"/>
+    <w:abstractNumId w:val="2"/>
   </w:num>
   <w:num w:numId="2" w16cid:durableId="368187933">
-    <w:abstractNumId w:val="4"/>
+    <w:abstractNumId w:val="1"/>
   </w:num>
   <w:num w:numId="3" w16cid:durableId="1113548266">
-    <w:abstractNumId w:val="1"/>
-  </w:num>
-  <w:num w:numId="4" w16cid:durableId="878708670">
     <w:abstractNumId w:val="0"/>
-  </w:num>
-  <w:num w:numId="5" w16cid:durableId="1450011146">
-    <w:abstractNumId w:val="2"/>
-  </w:num>
-  <w:num w:numId="6" w16cid:durableId="1335693631">
-    <w:abstractNumId w:val="6"/>
-  </w:num>
-  <w:num w:numId="7" w16cid:durableId="270818400">
-    <w:abstractNumId w:val="7"/>
-  </w:num>
-  <w:num w:numId="8" w16cid:durableId="2081515873">
-    <w:abstractNumId w:val="3"/>
   </w:num>
 </w:numbering>
 </file>
@@ -2693,6 +1419,7 @@
   <w:style w:type="character" w:default="1" w:styleId="Fontepargpadro">
     <w:name w:val="Default Paragraph Font"/>
     <w:uiPriority w:val="1"/>
+    <w:semiHidden/>
     <w:unhideWhenUsed/>
   </w:style>
   <w:style w:type="table" w:default="1" w:styleId="Tabelanormal">

</xml_diff>